<commit_message>
Auto: TenZilla update 14.10.2026 20:22
</commit_message>
<xml_diff>
--- a/docs/Tenzilla_Инструкция.docx
+++ b/docs/Tenzilla_Инструкция.docx
@@ -130,6 +130,32 @@
         <w:t>Что делает программа СЖАТИЕ:</w:t>
         <w:br/>
         <w:t>Плавно сжимает образец до заданного перемещения, фиксирует максимальную нагрузку, затем разгружает до ~0 Н и дополнительно поднимает шток вверх на заданное расстояние, чтобы освободить образец.</w:t>
+      </w:r>
+    </w:p>
+    <w:p>
+      <w:pPr>
+        <w:pStyle w:val="BodyText"/>
+        <w:numPr>
+          <w:ilvl w:val="0"/>
+          <w:numId w:val="2"/>
+        </w:numPr>
+        <w:pBdr/>
+        <w:tabs>
+          <w:tab w:val="clear" w:pos="709"/>
+          <w:tab w:val="left" w:pos="709" w:leader="none"/>
+        </w:tabs>
+        <w:bidi w:val="0"/>
+        <w:spacing w:before="0" w:after="0"/>
+        <w:ind w:hanging="283" w:start="709" w:end="0"/>
+        <w:jc w:val="start"/>
+        <w:rPr/>
+      </w:pPr>
+      <w:r>
+        <w:t>Что делает программа РАЗРЫВ (BREAK):</w:t>
+        <w:br/>
+      </w:r>
+      <w:r>
+        <w:t>Плавно нагружает образец вниз до разрушения: отслеживает максимальную нагрузку и завершает программу, когда сила падает на заданный процент от максимума (признак разрыва). Автоматической разгрузки и отката штока нет — двигатель просто останавливается.</w:t>
       </w:r>
     </w:p>
     <w:p>
@@ -3573,6 +3599,2044 @@
       </w:pPr>
       <w:r>
         <w:rPr/>
+      </w:r>
+    </w:p>
+    <w:p>
+      <w:pPr>
+        <w:pStyle w:val="BodyText"/>
+        <w:bidi w:val="0"/>
+        <w:ind w:hanging="0" w:start="0" w:end="0"/>
+        <w:jc w:val="center"/>
+        <w:rPr>
+          <w:b/>
+          <w:bCs/>
+        </w:rPr>
+      </w:pPr>
+    </w:p>
+    <w:p>
+      <w:pPr>
+        <w:pStyle w:val="Heading3"/>
+        <w:bidi w:val="0"/>
+        <w:ind w:hanging="0" w:start="0" w:end="0"/>
+        <w:jc w:val="start"/>
+        <w:rPr/>
+      </w:pPr>
+      <w:r>
+        <w:t>9. Подготовка к измерению РАЗРЫВА (BREAK)</w:t>
+      </w:r>
+    </w:p>
+    <w:p>
+      <w:pPr>
+        <w:pStyle w:val="Heading4"/>
+        <w:bidi w:val="0"/>
+        <w:ind w:hanging="0" w:start="0" w:end="0"/>
+        <w:jc w:val="start"/>
+        <w:rPr/>
+      </w:pPr>
+      <w:r>
+        <w:t>9.1. Переход на экран РАЗРЫВ</w:t>
+      </w:r>
+    </w:p>
+    <w:p>
+      <w:pPr>
+        <w:pStyle w:val="BodyText"/>
+        <w:numPr>
+          <w:ilvl w:val="0"/>
+          <w:numId w:val="2"/>
+        </w:numPr>
+        <w:pBdr/>
+        <w:tabs>
+          <w:tab w:val="clear" w:pos="709"/>
+          <w:tab w:val="left" w:pos="709" w:leader="none"/>
+        </w:tabs>
+        <w:bidi w:val="0"/>
+        <w:spacing w:before="0" w:after="0"/>
+        <w:ind w:hanging="283" w:start="709" w:end="0"/>
+        <w:jc w:val="start"/>
+        <w:rPr/>
+      </w:pPr>
+      <w:r>
+        <w:t>Короткими нажатиями кнопки на панели перейдите на экран с заголовком BREAK (экран «Разрыв»).</w:t>
+      </w:r>
+    </w:p>
+    <w:p>
+      <w:pPr>
+        <w:pStyle w:val="BodyText"/>
+        <w:numPr>
+          <w:ilvl w:val="0"/>
+          <w:numId w:val="2"/>
+        </w:numPr>
+        <w:pBdr/>
+        <w:tabs>
+          <w:tab w:val="clear" w:pos="709"/>
+          <w:tab w:val="left" w:pos="709" w:leader="none"/>
+        </w:tabs>
+        <w:bidi w:val="0"/>
+        <w:spacing w:before="0" w:after="0"/>
+        <w:ind w:hanging="283" w:start="709" w:end="0"/>
+        <w:jc w:val="start"/>
+        <w:rPr/>
+      </w:pPr>
+      <w:r>
+        <w:t>Именно с этого экрана запускается программа РАЗРЫВ (пункт START в меню). С главного экрана СЖАТИЯ стартует только программа СЖАТИЕ.</w:t>
+      </w:r>
+    </w:p>
+    <w:p>
+      <w:pPr>
+        <w:pStyle w:val="BodyText"/>
+        <w:numPr>
+          <w:ilvl w:val="0"/>
+          <w:numId w:val="2"/>
+        </w:numPr>
+        <w:pBdr/>
+        <w:tabs>
+          <w:tab w:val="clear" w:pos="709"/>
+          <w:tab w:val="left" w:pos="709" w:leader="none"/>
+        </w:tabs>
+        <w:bidi w:val="0"/>
+        <w:spacing w:before="0" w:after="0"/>
+        <w:ind w:hanging="283" w:start="709" w:end="0"/>
+        <w:jc w:val="start"/>
+        <w:rPr/>
+      </w:pPr>
+      <w:r>
+        <w:t>Убедитесь, что:</w:t>
+      </w:r>
+    </w:p>
+    <w:p>
+      <w:pPr>
+        <w:pStyle w:val="BodyText"/>
+        <w:numPr>
+          <w:ilvl w:val="1"/>
+          <w:numId w:val="2"/>
+        </w:numPr>
+        <w:pBdr/>
+        <w:tabs>
+          <w:tab w:val="clear" w:pos="709"/>
+          <w:tab w:val="left" w:pos="709" w:leader="none"/>
+        </w:tabs>
+        <w:bidi w:val="0"/>
+        <w:spacing w:before="90" w:after="0"/>
+        <w:ind w:hanging="283" w:start="709" w:end="0"/>
+        <w:jc w:val="start"/>
+        <w:rPr/>
+      </w:pPr>
+      <w:r>
+        <w:t>Программа не запущена (статус «Ready», «Completed», «Stopped» / «Готово»).</w:t>
+      </w:r>
+    </w:p>
+    <w:p>
+      <w:pPr>
+        <w:pStyle w:val="BodyText"/>
+        <w:numPr>
+          <w:ilvl w:val="1"/>
+          <w:numId w:val="2"/>
+        </w:numPr>
+        <w:pBdr/>
+        <w:tabs>
+          <w:tab w:val="clear" w:pos="709"/>
+          <w:tab w:val="left" w:pos="709" w:leader="none"/>
+        </w:tabs>
+        <w:bidi w:val="0"/>
+        <w:spacing w:before="90" w:after="0"/>
+        <w:ind w:hanging="283" w:start="709" w:end="0"/>
+        <w:jc w:val="start"/>
+        <w:rPr/>
+      </w:pPr>
+      <w:r>
+        <w:t>На экране отображается заголовок BREAK.</w:t>
+      </w:r>
+    </w:p>
+    <w:p>
+      <w:pPr>
+        <w:pStyle w:val="Heading4"/>
+        <w:bidi w:val="0"/>
+        <w:ind w:hanging="0" w:start="0" w:end="0"/>
+        <w:jc w:val="start"/>
+        <w:rPr/>
+      </w:pPr>
+      <w:r>
+        <w:t>9.2. Установка образца</w:t>
+      </w:r>
+    </w:p>
+    <w:p>
+      <w:pPr>
+        <w:pStyle w:val="BodyText"/>
+        <w:numPr>
+          <w:ilvl w:val="0"/>
+          <w:numId w:val="2"/>
+        </w:numPr>
+        <w:pBdr/>
+        <w:tabs>
+          <w:tab w:val="clear" w:pos="709"/>
+          <w:tab w:val="left" w:pos="709" w:leader="none"/>
+        </w:tabs>
+        <w:bidi w:val="0"/>
+        <w:spacing w:before="0" w:after="0"/>
+        <w:ind w:hanging="283" w:start="709" w:end="0"/>
+        <w:jc w:val="start"/>
+        <w:rPr/>
+      </w:pPr>
+      <w:r>
+        <w:t>Шток должен находиться в верхнем безопасном положении (без контакта с образцом) или чуть выше образца.</w:t>
+      </w:r>
+    </w:p>
+    <w:p>
+      <w:pPr>
+        <w:pStyle w:val="BodyText"/>
+        <w:numPr>
+          <w:ilvl w:val="0"/>
+          <w:numId w:val="2"/>
+        </w:numPr>
+        <w:pBdr/>
+        <w:tabs>
+          <w:tab w:val="clear" w:pos="709"/>
+          <w:tab w:val="left" w:pos="709" w:leader="none"/>
+        </w:tabs>
+        <w:bidi w:val="0"/>
+        <w:spacing w:before="0" w:after="0"/>
+        <w:ind w:hanging="283" w:start="709" w:end="0"/>
+        <w:jc w:val="start"/>
+        <w:rPr/>
+      </w:pPr>
+      <w:r>
+        <w:t>Установите образец между плитами/захватами так же, как для сжатия: нагрузка идёт вниз.</w:t>
+      </w:r>
+    </w:p>
+    <w:p>
+      <w:pPr>
+        <w:pStyle w:val="BodyText"/>
+        <w:numPr>
+          <w:ilvl w:val="0"/>
+          <w:numId w:val="2"/>
+        </w:numPr>
+        <w:pBdr/>
+        <w:tabs>
+          <w:tab w:val="clear" w:pos="709"/>
+          <w:tab w:val="left" w:pos="709" w:leader="none"/>
+        </w:tabs>
+        <w:bidi w:val="0"/>
+        <w:spacing w:before="0" w:after="0"/>
+        <w:ind w:hanging="283" w:start="709" w:end="0"/>
+        <w:jc w:val="start"/>
+        <w:rPr/>
+      </w:pPr>
+      <w:r>
+        <w:t>Убедитесь, что:</w:t>
+      </w:r>
+    </w:p>
+    <w:p>
+      <w:pPr>
+        <w:pStyle w:val="BodyText"/>
+        <w:numPr>
+          <w:ilvl w:val="1"/>
+          <w:numId w:val="2"/>
+        </w:numPr>
+        <w:pBdr/>
+        <w:tabs>
+          <w:tab w:val="clear" w:pos="709"/>
+          <w:tab w:val="left" w:pos="709" w:leader="none"/>
+        </w:tabs>
+        <w:bidi w:val="0"/>
+        <w:spacing w:before="90" w:after="0"/>
+        <w:ind w:hanging="283" w:start="709" w:end="0"/>
+        <w:jc w:val="start"/>
+        <w:rPr/>
+      </w:pPr>
+      <w:r>
+        <w:t>Образец расположен по центру, без перекосов.</w:t>
+      </w:r>
+    </w:p>
+    <w:p>
+      <w:pPr>
+        <w:pStyle w:val="BodyText"/>
+        <w:numPr>
+          <w:ilvl w:val="1"/>
+          <w:numId w:val="2"/>
+        </w:numPr>
+        <w:pBdr/>
+        <w:tabs>
+          <w:tab w:val="clear" w:pos="709"/>
+          <w:tab w:val="left" w:pos="709" w:leader="none"/>
+        </w:tabs>
+        <w:bidi w:val="0"/>
+        <w:spacing w:before="90" w:after="0"/>
+        <w:ind w:hanging="283" w:start="709" w:end="0"/>
+        <w:jc w:val="start"/>
+        <w:rPr/>
+      </w:pPr>
+      <w:r>
+        <w:t>Ничто не заклинило направляющие.</w:t>
+      </w:r>
+    </w:p>
+    <w:p>
+      <w:pPr>
+        <w:pStyle w:val="BodyText"/>
+        <w:numPr>
+          <w:ilvl w:val="1"/>
+          <w:numId w:val="2"/>
+        </w:numPr>
+        <w:pBdr/>
+        <w:tabs>
+          <w:tab w:val="clear" w:pos="709"/>
+          <w:tab w:val="left" w:pos="709" w:leader="none"/>
+        </w:tabs>
+        <w:bidi w:val="0"/>
+        <w:spacing w:before="90" w:after="0"/>
+        <w:ind w:hanging="283" w:start="709" w:end="0"/>
+        <w:jc w:val="start"/>
+        <w:rPr/>
+      </w:pPr>
+      <w:r>
+        <w:t>Образец рассчитан на разрушение под нагрузкой; после разрыва осколки не должны мешать движению штока.</w:t>
+      </w:r>
+    </w:p>
+    <w:p>
+      <w:pPr>
+        <w:pStyle w:val="Heading4"/>
+        <w:bidi w:val="0"/>
+        <w:ind w:hanging="0" w:start="0" w:end="0"/>
+        <w:jc w:val="start"/>
+        <w:rPr/>
+      </w:pPr>
+      <w:r>
+        <w:t>9.3. Проверка показаний нагрузки</w:t>
+      </w:r>
+    </w:p>
+    <w:p>
+      <w:pPr>
+        <w:pStyle w:val="BodyText"/>
+        <w:numPr>
+          <w:ilvl w:val="0"/>
+          <w:numId w:val="2"/>
+        </w:numPr>
+        <w:pBdr/>
+        <w:tabs>
+          <w:tab w:val="clear" w:pos="709"/>
+          <w:tab w:val="left" w:pos="709" w:leader="none"/>
+        </w:tabs>
+        <w:bidi w:val="0"/>
+        <w:spacing w:before="0" w:after="0"/>
+        <w:ind w:hanging="283" w:start="709" w:end="0"/>
+        <w:jc w:val="start"/>
+        <w:rPr/>
+      </w:pPr>
+      <w:r>
+        <w:t>На экране BREAK:</w:t>
+      </w:r>
+    </w:p>
+    <w:p>
+      <w:pPr>
+        <w:pStyle w:val="BodyText"/>
+        <w:numPr>
+          <w:ilvl w:val="1"/>
+          <w:numId w:val="2"/>
+        </w:numPr>
+        <w:pBdr/>
+        <w:tabs>
+          <w:tab w:val="clear" w:pos="709"/>
+          <w:tab w:val="left" w:pos="709" w:leader="none"/>
+        </w:tabs>
+        <w:bidi w:val="0"/>
+        <w:spacing w:before="90" w:after="0"/>
+        <w:ind w:hanging="283" w:start="709" w:end="0"/>
+        <w:jc w:val="start"/>
+        <w:rPr/>
+      </w:pPr>
+      <w:r>
+        <w:t>Значение текущей нагрузки (CUR.) без сжатия должно быть около 0 N (допустим небольшой дрейф, например ±0.5 N).</w:t>
+      </w:r>
+    </w:p>
+    <w:p>
+      <w:pPr>
+        <w:pStyle w:val="BodyText"/>
+        <w:numPr>
+          <w:ilvl w:val="0"/>
+          <w:numId w:val="2"/>
+        </w:numPr>
+        <w:pBdr/>
+        <w:tabs>
+          <w:tab w:val="clear" w:pos="709"/>
+          <w:tab w:val="left" w:pos="709" w:leader="none"/>
+        </w:tabs>
+        <w:bidi w:val="0"/>
+        <w:spacing w:before="0" w:after="0"/>
+        <w:ind w:hanging="283" w:start="709" w:end="0"/>
+        <w:jc w:val="start"/>
+        <w:rPr/>
+      </w:pPr>
+      <w:r>
+        <w:t>Если «ноль» сильно уехал — выполните RESET ZERO (долгое нажатие → меню) или обнуление через веб-интерфейс.</w:t>
+      </w:r>
+    </w:p>
+    <w:p>
+      <w:pPr>
+        <w:pStyle w:val="BodyText"/>
+        <w:numPr>
+          <w:ilvl w:val="0"/>
+          <w:numId w:val="2"/>
+        </w:numPr>
+        <w:pBdr/>
+        <w:tabs>
+          <w:tab w:val="clear" w:pos="709"/>
+          <w:tab w:val="left" w:pos="709" w:leader="none"/>
+        </w:tabs>
+        <w:bidi w:val="0"/>
+        <w:spacing w:before="0" w:after="0"/>
+        <w:ind w:hanging="283" w:start="709" w:end="0"/>
+        <w:jc w:val="start"/>
+        <w:rPr/>
+      </w:pPr>
+      <w:r>
+        <w:t>В правой части экрана отображается лимит нагрузки (LIM.), например 500 N. При превышении система остановит движение по перегрузке.</w:t>
+      </w:r>
+    </w:p>
+    <w:p>
+      <w:pPr>
+        <w:pStyle w:val="BodyText"/>
+        <w:bidi w:val="0"/>
+        <w:ind w:hanging="0" w:start="0" w:end="0"/>
+        <w:jc w:val="center"/>
+        <w:rPr>
+          <w:b/>
+          <w:bCs/>
+        </w:rPr>
+      </w:pPr>
+    </w:p>
+    <w:p>
+      <w:pPr>
+        <w:pStyle w:val="Heading3"/>
+        <w:bidi w:val="0"/>
+        <w:ind w:hanging="0" w:start="0" w:end="0"/>
+        <w:jc w:val="start"/>
+        <w:rPr/>
+      </w:pPr>
+      <w:r>
+        <w:t>10. Настройки программы РАЗРЫВ (основные)</w:t>
+      </w:r>
+    </w:p>
+    <w:p>
+      <w:pPr>
+        <w:pStyle w:val="BodyText"/>
+        <w:numPr>
+          <w:ilvl w:val="0"/>
+          <w:numId w:val="2"/>
+        </w:numPr>
+        <w:pBdr/>
+        <w:tabs>
+          <w:tab w:val="clear" w:pos="709"/>
+          <w:tab w:val="left" w:pos="709" w:leader="none"/>
+        </w:tabs>
+        <w:bidi w:val="0"/>
+        <w:spacing w:before="0" w:after="0"/>
+        <w:ind w:hanging="283" w:start="709" w:end="0"/>
+        <w:jc w:val="start"/>
+        <w:rPr/>
+      </w:pPr>
+      <w:r>
+        <w:t>По умолчанию параметры заданы так, чтобы можно было работать без изменения настроек:</w:t>
+      </w:r>
+    </w:p>
+    <w:p>
+      <w:pPr>
+        <w:pStyle w:val="BodyText"/>
+        <w:numPr>
+          <w:ilvl w:val="0"/>
+          <w:numId w:val="2"/>
+        </w:numPr>
+        <w:pBdr/>
+        <w:tabs>
+          <w:tab w:val="clear" w:pos="709"/>
+          <w:tab w:val="left" w:pos="709" w:leader="none"/>
+        </w:tabs>
+        <w:bidi w:val="0"/>
+        <w:spacing w:before="0" w:after="0"/>
+        <w:ind w:hanging="283" w:start="709" w:end="0"/>
+        <w:jc w:val="start"/>
+        <w:rPr/>
+      </w:pPr>
+      <w:r>
+        <w:t>Порог начала накопления (тот же, что у СЖАТИЯ / Compression start threshold) – 1 N</w:t>
+        <w:br/>
+        <w:t>До момента, когда нагрузка достигнет 1 N, система считает, что образец ещё не нагружен, и рабочее перемещение (WRK.) не считается.</w:t>
+      </w:r>
+    </w:p>
+    <w:p>
+      <w:pPr>
+        <w:pStyle w:val="BodyText"/>
+        <w:numPr>
+          <w:ilvl w:val="0"/>
+          <w:numId w:val="2"/>
+        </w:numPr>
+        <w:pBdr/>
+        <w:tabs>
+          <w:tab w:val="clear" w:pos="709"/>
+          <w:tab w:val="left" w:pos="709" w:leader="none"/>
+        </w:tabs>
+        <w:bidi w:val="0"/>
+        <w:spacing w:before="0" w:after="0"/>
+        <w:ind w:hanging="283" w:start="709" w:end="0"/>
+        <w:jc w:val="start"/>
+        <w:rPr/>
+      </w:pPr>
+      <w:r>
+        <w:t>Порог падения для разрыва (Break drop threshold) – 20 %</w:t>
+        <w:br/>
+        <w:t>После того как нагрузка достигла максимума, программа ждёт падения силы на 20 % (или более) от этого максимума и тогда завершает измерение.</w:t>
+      </w:r>
+    </w:p>
+    <w:p>
+      <w:pPr>
+        <w:pStyle w:val="BodyText"/>
+        <w:numPr>
+          <w:ilvl w:val="0"/>
+          <w:numId w:val="2"/>
+        </w:numPr>
+        <w:pBdr/>
+        <w:tabs>
+          <w:tab w:val="clear" w:pos="709"/>
+          <w:tab w:val="left" w:pos="709" w:leader="none"/>
+        </w:tabs>
+        <w:bidi w:val="0"/>
+        <w:spacing w:before="0" w:after="0"/>
+        <w:ind w:hanging="283" w:start="709" w:end="0"/>
+        <w:jc w:val="start"/>
+        <w:rPr/>
+      </w:pPr>
+      <w:r>
+        <w:t>Целевое перемещение для РАЗРЫВА не задаётся: программа не останавливается по миллиметрам, а только по падению силы (или по остановке оператором / защитам).</w:t>
+      </w:r>
+    </w:p>
+    <w:p>
+      <w:pPr>
+        <w:pStyle w:val="BodyText"/>
+        <w:numPr>
+          <w:ilvl w:val="0"/>
+          <w:numId w:val="2"/>
+        </w:numPr>
+        <w:pBdr/>
+        <w:tabs>
+          <w:tab w:val="clear" w:pos="709"/>
+          <w:tab w:val="left" w:pos="709" w:leader="none"/>
+        </w:tabs>
+        <w:bidi w:val="0"/>
+        <w:spacing w:before="0" w:after="0"/>
+        <w:ind w:hanging="283" w:start="709" w:end="0"/>
+        <w:jc w:val="start"/>
+        <w:rPr/>
+      </w:pPr>
+      <w:r>
+        <w:t>Если пользователь не меняет эти значения, программа работает именно с такими параметрами. Настройки меняются в веб-интерфейсе (раздел настроек программы) или на экране «Прочие настройки».</w:t>
+      </w:r>
+    </w:p>
+    <w:p>
+      <w:pPr>
+        <w:pStyle w:val="BodyText"/>
+        <w:bidi w:val="0"/>
+        <w:ind w:hanging="0" w:start="0" w:end="0"/>
+        <w:jc w:val="center"/>
+        <w:rPr>
+          <w:b/>
+          <w:bCs/>
+        </w:rPr>
+      </w:pPr>
+    </w:p>
+    <w:p>
+      <w:pPr>
+        <w:pStyle w:val="Heading3"/>
+        <w:bidi w:val="0"/>
+        <w:ind w:hanging="0" w:start="0" w:end="0"/>
+        <w:jc w:val="start"/>
+        <w:rPr/>
+      </w:pPr>
+      <w:r>
+        <w:t>11. Экран РАЗРЫВ / BREAK (TFT)</w:t>
+      </w:r>
+    </w:p>
+    <w:p>
+      <w:pPr>
+        <w:pStyle w:val="BodyText"/>
+        <w:numPr>
+          <w:ilvl w:val="0"/>
+          <w:numId w:val="2"/>
+        </w:numPr>
+        <w:pBdr/>
+        <w:tabs>
+          <w:tab w:val="clear" w:pos="709"/>
+          <w:tab w:val="left" w:pos="709" w:leader="none"/>
+        </w:tabs>
+        <w:bidi w:val="0"/>
+        <w:spacing w:before="0" w:after="0"/>
+        <w:ind w:hanging="283" w:start="709" w:end="0"/>
+        <w:jc w:val="start"/>
+        <w:rPr/>
+      </w:pPr>
+      <w:r>
+        <w:t>На экране BREAK вы увидите:</w:t>
+      </w:r>
+    </w:p>
+    <w:p>
+      <w:pPr>
+        <w:pStyle w:val="BodyText"/>
+        <w:numPr>
+          <w:ilvl w:val="0"/>
+          <w:numId w:val="2"/>
+        </w:numPr>
+        <w:pBdr/>
+        <w:tabs>
+          <w:tab w:val="clear" w:pos="709"/>
+          <w:tab w:val="left" w:pos="709" w:leader="none"/>
+        </w:tabs>
+        <w:bidi w:val="0"/>
+        <w:spacing w:before="0" w:after="0"/>
+        <w:ind w:hanging="283" w:start="709" w:end="0"/>
+        <w:jc w:val="start"/>
+        <w:rPr/>
+      </w:pPr>
+      <w:r>
+        <w:t>Текущая нагрузка (CUR.) – крупным шрифтом.</w:t>
+      </w:r>
+    </w:p>
+    <w:p>
+      <w:pPr>
+        <w:pStyle w:val="BodyText"/>
+        <w:numPr>
+          <w:ilvl w:val="0"/>
+          <w:numId w:val="2"/>
+        </w:numPr>
+        <w:pBdr/>
+        <w:tabs>
+          <w:tab w:val="clear" w:pos="709"/>
+          <w:tab w:val="left" w:pos="709" w:leader="none"/>
+        </w:tabs>
+        <w:bidi w:val="0"/>
+        <w:spacing w:before="0" w:after="0"/>
+        <w:ind w:hanging="283" w:start="709" w:end="0"/>
+        <w:jc w:val="start"/>
+        <w:rPr/>
+      </w:pPr>
+      <w:r>
+        <w:t>Максимальная достигнутая нагрузка (MAX.).</w:t>
+      </w:r>
+    </w:p>
+    <w:p>
+      <w:pPr>
+        <w:pStyle w:val="BodyText"/>
+        <w:numPr>
+          <w:ilvl w:val="0"/>
+          <w:numId w:val="2"/>
+        </w:numPr>
+        <w:pBdr/>
+        <w:tabs>
+          <w:tab w:val="clear" w:pos="709"/>
+          <w:tab w:val="left" w:pos="709" w:leader="none"/>
+        </w:tabs>
+        <w:bidi w:val="0"/>
+        <w:spacing w:before="0" w:after="0"/>
+        <w:ind w:hanging="283" w:start="709" w:end="0"/>
+        <w:jc w:val="start"/>
+        <w:rPr/>
+      </w:pPr>
+      <w:r>
+        <w:t>Лимит нагрузки (LIM.) (например, 500 N).</w:t>
+      </w:r>
+    </w:p>
+    <w:p>
+      <w:pPr>
+        <w:pStyle w:val="BodyText"/>
+        <w:numPr>
+          <w:ilvl w:val="0"/>
+          <w:numId w:val="2"/>
+        </w:numPr>
+        <w:pBdr/>
+        <w:tabs>
+          <w:tab w:val="clear" w:pos="709"/>
+          <w:tab w:val="left" w:pos="709" w:leader="none"/>
+        </w:tabs>
+        <w:bidi w:val="0"/>
+        <w:spacing w:before="0" w:after="0"/>
+        <w:ind w:hanging="283" w:start="709" w:end="0"/>
+        <w:jc w:val="start"/>
+        <w:rPr/>
+      </w:pPr>
+      <w:r>
+        <w:t>Рабочее перемещение (WRK.) и абсолютное перемещение (MOV.) в мм.</w:t>
+      </w:r>
+    </w:p>
+    <w:p>
+      <w:pPr>
+        <w:pStyle w:val="BodyText"/>
+        <w:numPr>
+          <w:ilvl w:val="0"/>
+          <w:numId w:val="2"/>
+        </w:numPr>
+        <w:pBdr/>
+        <w:tabs>
+          <w:tab w:val="clear" w:pos="709"/>
+          <w:tab w:val="left" w:pos="709" w:leader="none"/>
+        </w:tabs>
+        <w:bidi w:val="0"/>
+        <w:spacing w:before="0" w:after="0"/>
+        <w:ind w:hanging="283" w:start="709" w:end="0"/>
+        <w:jc w:val="start"/>
+        <w:rPr/>
+      </w:pPr>
+      <w:r>
+        <w:t>Статус программы:</w:t>
+      </w:r>
+    </w:p>
+    <w:p>
+      <w:pPr>
+        <w:pStyle w:val="BodyText"/>
+        <w:numPr>
+          <w:ilvl w:val="1"/>
+          <w:numId w:val="2"/>
+        </w:numPr>
+        <w:pBdr/>
+        <w:tabs>
+          <w:tab w:val="clear" w:pos="709"/>
+          <w:tab w:val="left" w:pos="709" w:leader="none"/>
+        </w:tabs>
+        <w:bidi w:val="0"/>
+        <w:spacing w:before="90" w:after="0"/>
+        <w:ind w:hanging="283" w:start="709" w:end="0"/>
+        <w:jc w:val="start"/>
+        <w:rPr/>
+      </w:pPr>
+      <w:r>
+        <w:t>«Готово» / «Ready»</w:t>
+      </w:r>
+    </w:p>
+    <w:p>
+      <w:pPr>
+        <w:pStyle w:val="BodyText"/>
+        <w:numPr>
+          <w:ilvl w:val="1"/>
+          <w:numId w:val="2"/>
+        </w:numPr>
+        <w:pBdr/>
+        <w:tabs>
+          <w:tab w:val="clear" w:pos="709"/>
+          <w:tab w:val="left" w:pos="709" w:leader="none"/>
+        </w:tabs>
+        <w:bidi w:val="0"/>
+        <w:spacing w:before="90" w:after="0"/>
+        <w:ind w:hanging="283" w:start="709" w:end="0"/>
+        <w:jc w:val="start"/>
+        <w:rPr/>
+      </w:pPr>
+      <w:r>
+        <w:t>«Waiting …» (с миганием перед стартом)</w:t>
+      </w:r>
+    </w:p>
+    <w:p>
+      <w:pPr>
+        <w:pStyle w:val="BodyText"/>
+        <w:numPr>
+          <w:ilvl w:val="1"/>
+          <w:numId w:val="2"/>
+        </w:numPr>
+        <w:pBdr/>
+        <w:tabs>
+          <w:tab w:val="clear" w:pos="709"/>
+          <w:tab w:val="left" w:pos="709" w:leader="none"/>
+        </w:tabs>
+        <w:bidi w:val="0"/>
+        <w:spacing w:before="90" w:after="0"/>
+        <w:ind w:hanging="283" w:start="709" w:end="0"/>
+        <w:jc w:val="start"/>
+        <w:rPr/>
+      </w:pPr>
+      <w:r>
+        <w:t>«Running…» / «Measuring…»</w:t>
+      </w:r>
+    </w:p>
+    <w:p>
+      <w:pPr>
+        <w:pStyle w:val="BodyText"/>
+        <w:numPr>
+          <w:ilvl w:val="1"/>
+          <w:numId w:val="2"/>
+        </w:numPr>
+        <w:pBdr/>
+        <w:tabs>
+          <w:tab w:val="clear" w:pos="709"/>
+          <w:tab w:val="left" w:pos="709" w:leader="none"/>
+        </w:tabs>
+        <w:bidi w:val="0"/>
+        <w:spacing w:before="90" w:after="0"/>
+        <w:ind w:hanging="283" w:start="709" w:end="0"/>
+        <w:jc w:val="start"/>
+        <w:rPr/>
+      </w:pPr>
+      <w:r>
+        <w:t>«Completed» / «Stopped» / ошибки.</w:t>
+      </w:r>
+    </w:p>
+    <w:p>
+      <w:pPr>
+        <w:pStyle w:val="BodyText"/>
+        <w:numPr>
+          <w:ilvl w:val="0"/>
+          <w:numId w:val="2"/>
+        </w:numPr>
+        <w:pBdr/>
+        <w:tabs>
+          <w:tab w:val="clear" w:pos="709"/>
+          <w:tab w:val="left" w:pos="709" w:leader="none"/>
+        </w:tabs>
+        <w:bidi w:val="0"/>
+        <w:spacing w:before="0" w:after="0"/>
+        <w:ind w:hanging="283" w:start="709" w:end="0"/>
+        <w:jc w:val="start"/>
+        <w:rPr/>
+      </w:pPr>
+      <w:r>
+        <w:t>В веб-интерфейсе на вкладке «РАЗРЫВ» доступны те же показания, сброс MAX и кнопка запуска программы РАЗРЫВ, а также кнопки Вверх / СТОП / Вниз для ручного управления штоком.</w:t>
+      </w:r>
+    </w:p>
+    <w:p>
+      <w:pPr>
+        <w:pStyle w:val="BodyText"/>
+        <w:bidi w:val="0"/>
+        <w:ind w:hanging="0" w:start="0" w:end="0"/>
+        <w:jc w:val="center"/>
+        <w:rPr>
+          <w:b/>
+          <w:bCs/>
+        </w:rPr>
+      </w:pPr>
+    </w:p>
+    <w:p>
+      <w:pPr>
+        <w:pStyle w:val="Heading3"/>
+        <w:bidi w:val="0"/>
+        <w:ind w:hanging="0" w:start="0" w:end="0"/>
+        <w:jc w:val="start"/>
+        <w:rPr/>
+      </w:pPr>
+      <w:r>
+        <w:t>12. Пошаговая работа с программой РАЗРЫВ</w:t>
+      </w:r>
+    </w:p>
+    <w:p>
+      <w:pPr>
+        <w:pStyle w:val="Heading4"/>
+        <w:bidi w:val="0"/>
+        <w:ind w:hanging="0" w:start="0" w:end="0"/>
+        <w:jc w:val="start"/>
+        <w:rPr/>
+      </w:pPr>
+      <w:r>
+        <w:t>12.1. Подготовка перед запуском</w:t>
+      </w:r>
+    </w:p>
+    <w:p>
+      <w:pPr>
+        <w:pStyle w:val="BodyText"/>
+        <w:numPr>
+          <w:ilvl w:val="0"/>
+          <w:numId w:val="2"/>
+        </w:numPr>
+        <w:pBdr/>
+        <w:tabs>
+          <w:tab w:val="clear" w:pos="709"/>
+          <w:tab w:val="left" w:pos="709" w:leader="none"/>
+        </w:tabs>
+        <w:bidi w:val="0"/>
+        <w:spacing w:before="0" w:after="0"/>
+        <w:ind w:hanging="283" w:start="709" w:end="0"/>
+        <w:jc w:val="start"/>
+        <w:rPr/>
+      </w:pPr>
+      <w:r>
+        <w:t>Убедитесь, что:</w:t>
+      </w:r>
+    </w:p>
+    <w:p>
+      <w:pPr>
+        <w:pStyle w:val="BodyText"/>
+        <w:numPr>
+          <w:ilvl w:val="1"/>
+          <w:numId w:val="2"/>
+        </w:numPr>
+        <w:pBdr/>
+        <w:tabs>
+          <w:tab w:val="clear" w:pos="709"/>
+          <w:tab w:val="left" w:pos="709" w:leader="none"/>
+        </w:tabs>
+        <w:bidi w:val="0"/>
+        <w:spacing w:before="90" w:after="0"/>
+        <w:ind w:hanging="283" w:start="709" w:end="0"/>
+        <w:jc w:val="start"/>
+        <w:rPr/>
+      </w:pPr>
+      <w:r>
+        <w:t>Открыт экран BREAK.</w:t>
+      </w:r>
+    </w:p>
+    <w:p>
+      <w:pPr>
+        <w:pStyle w:val="BodyText"/>
+        <w:numPr>
+          <w:ilvl w:val="1"/>
+          <w:numId w:val="2"/>
+        </w:numPr>
+        <w:pBdr/>
+        <w:tabs>
+          <w:tab w:val="clear" w:pos="709"/>
+          <w:tab w:val="left" w:pos="709" w:leader="none"/>
+        </w:tabs>
+        <w:bidi w:val="0"/>
+        <w:spacing w:before="90" w:after="0"/>
+        <w:ind w:hanging="283" w:start="709" w:end="0"/>
+        <w:jc w:val="start"/>
+        <w:rPr/>
+      </w:pPr>
+      <w:r>
+        <w:t>Образец установлен и зафиксирован.</w:t>
+      </w:r>
+    </w:p>
+    <w:p>
+      <w:pPr>
+        <w:pStyle w:val="BodyText"/>
+        <w:numPr>
+          <w:ilvl w:val="1"/>
+          <w:numId w:val="2"/>
+        </w:numPr>
+        <w:pBdr/>
+        <w:tabs>
+          <w:tab w:val="clear" w:pos="709"/>
+          <w:tab w:val="left" w:pos="709" w:leader="none"/>
+        </w:tabs>
+        <w:bidi w:val="0"/>
+        <w:spacing w:before="90" w:after="0"/>
+        <w:ind w:hanging="283" w:start="709" w:end="0"/>
+        <w:jc w:val="start"/>
+        <w:rPr/>
+      </w:pPr>
+      <w:r>
+        <w:t>Верхняя плита (шток) чуть касается образца или находится в безопасной близости от него.</w:t>
+      </w:r>
+    </w:p>
+    <w:p>
+      <w:pPr>
+        <w:pStyle w:val="BodyText"/>
+        <w:numPr>
+          <w:ilvl w:val="0"/>
+          <w:numId w:val="2"/>
+        </w:numPr>
+        <w:pBdr/>
+        <w:tabs>
+          <w:tab w:val="clear" w:pos="709"/>
+          <w:tab w:val="left" w:pos="709" w:leader="none"/>
+        </w:tabs>
+        <w:bidi w:val="0"/>
+        <w:spacing w:before="0" w:after="0"/>
+        <w:ind w:hanging="283" w:start="709" w:end="0"/>
+        <w:jc w:val="start"/>
+        <w:rPr/>
+      </w:pPr>
+      <w:r>
+        <w:t>Проверьте на экране:</w:t>
+      </w:r>
+    </w:p>
+    <w:p>
+      <w:pPr>
+        <w:pStyle w:val="BodyText"/>
+        <w:numPr>
+          <w:ilvl w:val="1"/>
+          <w:numId w:val="2"/>
+        </w:numPr>
+        <w:pBdr/>
+        <w:tabs>
+          <w:tab w:val="clear" w:pos="709"/>
+          <w:tab w:val="left" w:pos="709" w:leader="none"/>
+        </w:tabs>
+        <w:bidi w:val="0"/>
+        <w:spacing w:before="90" w:after="0"/>
+        <w:ind w:hanging="283" w:start="709" w:end="0"/>
+        <w:jc w:val="start"/>
+        <w:rPr/>
+      </w:pPr>
+      <w:r>
+        <w:t>Текущая нагрузка (CUR.) близка к 0 N.</w:t>
+      </w:r>
+    </w:p>
+    <w:p>
+      <w:pPr>
+        <w:pStyle w:val="BodyText"/>
+        <w:numPr>
+          <w:ilvl w:val="1"/>
+          <w:numId w:val="2"/>
+        </w:numPr>
+        <w:pBdr/>
+        <w:tabs>
+          <w:tab w:val="clear" w:pos="709"/>
+          <w:tab w:val="left" w:pos="709" w:leader="none"/>
+        </w:tabs>
+        <w:bidi w:val="0"/>
+        <w:spacing w:before="90" w:after="0"/>
+        <w:ind w:hanging="283" w:start="709" w:end="0"/>
+        <w:jc w:val="start"/>
+        <w:rPr/>
+      </w:pPr>
+      <w:r>
+        <w:t>Программа не запущена.</w:t>
+      </w:r>
+    </w:p>
+    <w:p>
+      <w:pPr>
+        <w:pStyle w:val="Heading4"/>
+        <w:bidi w:val="0"/>
+        <w:ind w:hanging="0" w:start="0" w:end="0"/>
+        <w:jc w:val="start"/>
+        <w:rPr/>
+      </w:pPr>
+      <w:r>
+        <w:t>12.2. Запуск программы</w:t>
+      </w:r>
+    </w:p>
+    <w:p>
+      <w:pPr>
+        <w:pStyle w:val="BodyText"/>
+        <w:numPr>
+          <w:ilvl w:val="0"/>
+          <w:numId w:val="2"/>
+        </w:numPr>
+        <w:pBdr/>
+        <w:tabs>
+          <w:tab w:val="clear" w:pos="709"/>
+          <w:tab w:val="left" w:pos="709" w:leader="none"/>
+        </w:tabs>
+        <w:bidi w:val="0"/>
+        <w:spacing w:before="0" w:after="0"/>
+        <w:ind w:hanging="283" w:start="709" w:end="0"/>
+        <w:jc w:val="start"/>
+        <w:rPr/>
+      </w:pPr>
+      <w:r>
+        <w:t>Зажмите кнопку на панели машины на 2 сек. и более до появления диалогового окна с пунктами:</w:t>
+      </w:r>
+    </w:p>
+    <w:p>
+      <w:pPr>
+        <w:pStyle w:val="BodyText"/>
+        <w:numPr>
+          <w:ilvl w:val="1"/>
+          <w:numId w:val="2"/>
+        </w:numPr>
+        <w:pBdr/>
+        <w:tabs>
+          <w:tab w:val="clear" w:pos="709"/>
+          <w:tab w:val="left" w:pos="709" w:leader="none"/>
+        </w:tabs>
+        <w:bidi w:val="0"/>
+        <w:spacing w:before="90" w:after="0"/>
+        <w:ind w:hanging="283" w:start="709" w:end="0"/>
+        <w:jc w:val="start"/>
+        <w:rPr/>
+      </w:pPr>
+      <w:r>
+        <w:t>START — Старт программы РАЗРЫВ (пока открыт экран BREAK)</w:t>
+      </w:r>
+    </w:p>
+    <w:p>
+      <w:pPr>
+        <w:pStyle w:val="BodyText"/>
+        <w:numPr>
+          <w:ilvl w:val="1"/>
+          <w:numId w:val="2"/>
+        </w:numPr>
+        <w:pBdr/>
+        <w:tabs>
+          <w:tab w:val="clear" w:pos="709"/>
+          <w:tab w:val="left" w:pos="709" w:leader="none"/>
+        </w:tabs>
+        <w:bidi w:val="0"/>
+        <w:spacing w:before="90" w:after="0"/>
+        <w:ind w:hanging="283" w:start="709" w:end="0"/>
+        <w:jc w:val="start"/>
+        <w:rPr/>
+      </w:pPr>
+      <w:r>
+        <w:t>RESET MOV — Установка нуля по перемещению</w:t>
+      </w:r>
+    </w:p>
+    <w:p>
+      <w:pPr>
+        <w:pStyle w:val="BodyText"/>
+        <w:numPr>
+          <w:ilvl w:val="1"/>
+          <w:numId w:val="2"/>
+        </w:numPr>
+        <w:pBdr/>
+        <w:tabs>
+          <w:tab w:val="clear" w:pos="709"/>
+          <w:tab w:val="left" w:pos="709" w:leader="none"/>
+        </w:tabs>
+        <w:bidi w:val="0"/>
+        <w:spacing w:before="90" w:after="0"/>
+        <w:ind w:hanging="283" w:start="709" w:end="0"/>
+        <w:jc w:val="start"/>
+        <w:rPr/>
+      </w:pPr>
+      <w:r>
+        <w:t>RESET ZERO — Установка нуля тензодатчика</w:t>
+      </w:r>
+    </w:p>
+    <w:p>
+      <w:pPr>
+        <w:pStyle w:val="BodyText"/>
+        <w:numPr>
+          <w:ilvl w:val="1"/>
+          <w:numId w:val="2"/>
+        </w:numPr>
+        <w:pBdr/>
+        <w:tabs>
+          <w:tab w:val="clear" w:pos="709"/>
+          <w:tab w:val="left" w:pos="709" w:leader="none"/>
+        </w:tabs>
+        <w:bidi w:val="0"/>
+        <w:spacing w:before="90" w:after="0"/>
+        <w:ind w:hanging="283" w:start="709" w:end="0"/>
+        <w:jc w:val="start"/>
+        <w:rPr/>
+      </w:pPr>
+      <w:r>
+        <w:t>EXIT — Выход в предыдущий экран</w:t>
+      </w:r>
+    </w:p>
+    <w:p>
+      <w:pPr>
+        <w:pStyle w:val="BodyText"/>
+        <w:numPr>
+          <w:ilvl w:val="0"/>
+          <w:numId w:val="2"/>
+        </w:numPr>
+        <w:pBdr/>
+        <w:tabs>
+          <w:tab w:val="clear" w:pos="709"/>
+          <w:tab w:val="left" w:pos="709" w:leader="none"/>
+        </w:tabs>
+        <w:bidi w:val="0"/>
+        <w:spacing w:before="0" w:after="0"/>
+        <w:ind w:hanging="283" w:start="709" w:end="0"/>
+        <w:jc w:val="start"/>
+        <w:rPr/>
+      </w:pPr>
+      <w:r>
+        <w:t>Выберите START короткими нажатиями и зажмите его на 2 и более сек. для начала работы. Или на вкладке «РАЗРЫВ» в веб-интерфейсе нажмите «Запустить программу РАЗРЫВ».</w:t>
+      </w:r>
+    </w:p>
+    <w:p>
+      <w:pPr>
+        <w:pStyle w:val="BodyText"/>
+        <w:numPr>
+          <w:ilvl w:val="0"/>
+          <w:numId w:val="2"/>
+        </w:numPr>
+        <w:pBdr/>
+        <w:tabs>
+          <w:tab w:val="clear" w:pos="709"/>
+          <w:tab w:val="left" w:pos="709" w:leader="none"/>
+        </w:tabs>
+        <w:bidi w:val="0"/>
+        <w:spacing w:before="0" w:after="0"/>
+        <w:ind w:hanging="283" w:start="709" w:end="0"/>
+        <w:jc w:val="start"/>
+        <w:rPr/>
+      </w:pPr>
+      <w:r>
+        <w:t>Программа:</w:t>
+      </w:r>
+    </w:p>
+    <w:p>
+      <w:pPr>
+        <w:pStyle w:val="BodyText"/>
+        <w:numPr>
+          <w:ilvl w:val="1"/>
+          <w:numId w:val="2"/>
+        </w:numPr>
+        <w:pBdr/>
+        <w:tabs>
+          <w:tab w:val="clear" w:pos="709"/>
+          <w:tab w:val="left" w:pos="709" w:leader="none"/>
+        </w:tabs>
+        <w:bidi w:val="0"/>
+        <w:spacing w:before="90" w:after="0"/>
+        <w:ind w:hanging="283" w:start="709" w:end="0"/>
+        <w:jc w:val="start"/>
+        <w:rPr/>
+      </w:pPr>
+      <w:r>
+        <w:t>Включит ожидание (Waiting) – пауза около 5 секунд перед стартом, статус «Waiting: Xs» может мигать.</w:t>
+      </w:r>
+    </w:p>
+    <w:p>
+      <w:pPr>
+        <w:pStyle w:val="BodyText"/>
+        <w:numPr>
+          <w:ilvl w:val="1"/>
+          <w:numId w:val="2"/>
+        </w:numPr>
+        <w:pBdr/>
+        <w:tabs>
+          <w:tab w:val="clear" w:pos="709"/>
+          <w:tab w:val="left" w:pos="709" w:leader="none"/>
+        </w:tabs>
+        <w:bidi w:val="0"/>
+        <w:spacing w:before="90" w:after="0"/>
+        <w:ind w:hanging="283" w:start="709" w:end="0"/>
+        <w:jc w:val="start"/>
+        <w:rPr/>
+      </w:pPr>
+      <w:r>
+        <w:t>Затем начнёт движение вниз автоматически.</w:t>
+      </w:r>
+    </w:p>
+    <w:p>
+      <w:pPr>
+        <w:pStyle w:val="Heading4"/>
+        <w:bidi w:val="0"/>
+        <w:ind w:hanging="0" w:start="0" w:end="0"/>
+        <w:jc w:val="start"/>
+        <w:rPr/>
+      </w:pPr>
+      <w:r>
+        <w:t>12.3. Фазы работы программы РАЗРЫВ (для понимания)</w:t>
+      </w:r>
+    </w:p>
+    <w:p>
+      <w:pPr>
+        <w:pStyle w:val="BodyText"/>
+        <w:numPr>
+          <w:ilvl w:val="0"/>
+          <w:numId w:val="2"/>
+        </w:numPr>
+        <w:pBdr/>
+        <w:tabs>
+          <w:tab w:val="clear" w:pos="709"/>
+          <w:tab w:val="left" w:pos="709" w:leader="none"/>
+        </w:tabs>
+        <w:bidi w:val="0"/>
+        <w:spacing w:before="0" w:after="0"/>
+        <w:ind w:hanging="283" w:start="709" w:end="0"/>
+        <w:jc w:val="start"/>
+        <w:rPr/>
+      </w:pPr>
+      <w:r>
+        <w:t>Фаза 1: ожидание (Waiting)</w:t>
+        <w:br/>
+        <w:t>Краткая пауза (~5 с) перед движением, на экране мигает «Waiting».</w:t>
+      </w:r>
+    </w:p>
+    <w:p>
+      <w:pPr>
+        <w:pStyle w:val="BodyText"/>
+        <w:numPr>
+          <w:ilvl w:val="0"/>
+          <w:numId w:val="2"/>
+        </w:numPr>
+        <w:pBdr/>
+        <w:tabs>
+          <w:tab w:val="clear" w:pos="709"/>
+          <w:tab w:val="left" w:pos="709" w:leader="none"/>
+        </w:tabs>
+        <w:bidi w:val="0"/>
+        <w:spacing w:before="0" w:after="0"/>
+        <w:ind w:hanging="283" w:start="709" w:end="0"/>
+        <w:jc w:val="start"/>
+        <w:rPr/>
+      </w:pPr>
+      <w:r>
+        <w:t>Фаза 2: движение вниз до начала накопления</w:t>
+        <w:br/>
+        <w:t>Шток опускается, нагрузка постепенно растёт.</w:t>
+        <w:br/>
+        <w:t>Когда нагрузка впервые достигнет порога начала (по умолчанию 1 N), программа:</w:t>
+      </w:r>
+    </w:p>
+    <w:p>
+      <w:pPr>
+        <w:pStyle w:val="BodyText"/>
+        <w:numPr>
+          <w:ilvl w:val="1"/>
+          <w:numId w:val="2"/>
+        </w:numPr>
+        <w:pBdr/>
+        <w:tabs>
+          <w:tab w:val="clear" w:pos="709"/>
+          <w:tab w:val="left" w:pos="709" w:leader="none"/>
+        </w:tabs>
+        <w:bidi w:val="0"/>
+        <w:spacing w:before="90" w:after="0"/>
+        <w:ind w:hanging="283" w:start="709" w:end="0"/>
+        <w:jc w:val="start"/>
+        <w:rPr/>
+      </w:pPr>
+      <w:r>
+        <w:t>Запоминает текущую позицию энкодера.</w:t>
+      </w:r>
+    </w:p>
+    <w:p>
+      <w:pPr>
+        <w:pStyle w:val="BodyText"/>
+        <w:numPr>
+          <w:ilvl w:val="1"/>
+          <w:numId w:val="2"/>
+        </w:numPr>
+        <w:pBdr/>
+        <w:tabs>
+          <w:tab w:val="clear" w:pos="709"/>
+          <w:tab w:val="left" w:pos="709" w:leader="none"/>
+        </w:tabs>
+        <w:bidi w:val="0"/>
+        <w:spacing w:before="90" w:after="0"/>
+        <w:ind w:hanging="283" w:start="709" w:end="0"/>
+        <w:jc w:val="start"/>
+        <w:rPr/>
+      </w:pPr>
+      <w:r>
+        <w:t>Начинает считать рабочее перемещение (WRK.) от этой точки.</w:t>
+      </w:r>
+    </w:p>
+    <w:p>
+      <w:pPr>
+        <w:pStyle w:val="BodyText"/>
+        <w:numPr>
+          <w:ilvl w:val="1"/>
+          <w:numId w:val="2"/>
+        </w:numPr>
+        <w:pBdr/>
+        <w:tabs>
+          <w:tab w:val="clear" w:pos="709"/>
+          <w:tab w:val="left" w:pos="709" w:leader="none"/>
+        </w:tabs>
+        <w:bidi w:val="0"/>
+        <w:spacing w:before="90" w:after="0"/>
+        <w:ind w:hanging="283" w:start="709" w:end="0"/>
+        <w:jc w:val="start"/>
+        <w:rPr/>
+      </w:pPr>
+      <w:r>
+        <w:t>Начинает отслеживать максимальную нагрузку (MAX.).</w:t>
+      </w:r>
+    </w:p>
+    <w:p>
+      <w:pPr>
+        <w:pStyle w:val="BodyText"/>
+        <w:numPr>
+          <w:ilvl w:val="0"/>
+          <w:numId w:val="2"/>
+        </w:numPr>
+        <w:pBdr/>
+        <w:tabs>
+          <w:tab w:val="clear" w:pos="709"/>
+          <w:tab w:val="left" w:pos="709" w:leader="none"/>
+        </w:tabs>
+        <w:bidi w:val="0"/>
+        <w:spacing w:before="0" w:after="0"/>
+        <w:ind w:hanging="283" w:start="709" w:end="0"/>
+        <w:jc w:val="start"/>
+        <w:rPr/>
+      </w:pPr>
+      <w:r>
+        <w:t>Фаза 3: измерение до разрыва</w:t>
+        <w:br/>
+        <w:t>Шток продолжает движение вниз.</w:t>
+        <w:br/>
+        <w:t>Система обновляет MAX., пока нагрузка растёт.</w:t>
+        <w:br/>
+        <w:t>После того как максимум зафиксирован, при падении текущей силы на заданный процент от MAX. (по умолчанию 20 %) программа считает, что образец разрушился:</w:t>
+      </w:r>
+    </w:p>
+    <w:p>
+      <w:pPr>
+        <w:pStyle w:val="BodyText"/>
+        <w:numPr>
+          <w:ilvl w:val="1"/>
+          <w:numId w:val="2"/>
+        </w:numPr>
+        <w:pBdr/>
+        <w:tabs>
+          <w:tab w:val="clear" w:pos="709"/>
+          <w:tab w:val="left" w:pos="709" w:leader="none"/>
+        </w:tabs>
+        <w:bidi w:val="0"/>
+        <w:spacing w:before="90" w:after="0"/>
+        <w:ind w:hanging="283" w:start="709" w:end="0"/>
+        <w:jc w:val="start"/>
+        <w:rPr/>
+      </w:pPr>
+      <w:r>
+        <w:t>Двигатель останавливается.</w:t>
+      </w:r>
+    </w:p>
+    <w:p>
+      <w:pPr>
+        <w:pStyle w:val="BodyText"/>
+        <w:numPr>
+          <w:ilvl w:val="1"/>
+          <w:numId w:val="2"/>
+        </w:numPr>
+        <w:pBdr/>
+        <w:tabs>
+          <w:tab w:val="clear" w:pos="709"/>
+          <w:tab w:val="left" w:pos="709" w:leader="none"/>
+        </w:tabs>
+        <w:bidi w:val="0"/>
+        <w:spacing w:before="90" w:after="0"/>
+        <w:ind w:hanging="283" w:start="709" w:end="0"/>
+        <w:jc w:val="start"/>
+        <w:rPr/>
+      </w:pPr>
+      <w:r>
+        <w:t>Звучит одиночный протяжный гудок.</w:t>
+      </w:r>
+    </w:p>
+    <w:p>
+      <w:pPr>
+        <w:pStyle w:val="BodyText"/>
+        <w:numPr>
+          <w:ilvl w:val="1"/>
+          <w:numId w:val="2"/>
+        </w:numPr>
+        <w:pBdr/>
+        <w:tabs>
+          <w:tab w:val="clear" w:pos="709"/>
+          <w:tab w:val="left" w:pos="709" w:leader="none"/>
+        </w:tabs>
+        <w:bidi w:val="0"/>
+        <w:spacing w:before="90" w:after="0"/>
+        <w:ind w:hanging="283" w:start="709" w:end="0"/>
+        <w:jc w:val="start"/>
+        <w:rPr/>
+      </w:pPr>
+      <w:r>
+        <w:t>На экране и в памяти сохраняется максимальная нагрузка (MAX.) — результат испытания.</w:t>
+      </w:r>
+    </w:p>
+    <w:p>
+      <w:pPr>
+        <w:pStyle w:val="BodyText"/>
+        <w:numPr>
+          <w:ilvl w:val="0"/>
+          <w:numId w:val="2"/>
+        </w:numPr>
+        <w:pBdr/>
+        <w:tabs>
+          <w:tab w:val="clear" w:pos="709"/>
+          <w:tab w:val="left" w:pos="709" w:leader="none"/>
+        </w:tabs>
+        <w:bidi w:val="0"/>
+        <w:spacing w:before="0" w:after="0"/>
+        <w:ind w:hanging="283" w:start="709" w:end="0"/>
+        <w:jc w:val="start"/>
+        <w:rPr/>
+      </w:pPr>
+      <w:r>
+        <w:t>Важно: в отличие от СЖАТИЯ, после завершения РАЗРЫВА автоматической разгрузки и дополнительного подъёма штока нет. При необходимости поднимите шток вручную (кнопка «Вверх» в веб-интерфейсе или аппаратное управление) и снимите образец.</w:t>
+      </w:r>
+    </w:p>
+    <w:p>
+      <w:pPr>
+        <w:pStyle w:val="BodyText"/>
+        <w:bidi w:val="0"/>
+        <w:ind w:hanging="0" w:start="0" w:end="0"/>
+        <w:jc w:val="center"/>
+        <w:rPr>
+          <w:b/>
+          <w:bCs/>
+        </w:rPr>
+      </w:pPr>
+    </w:p>
+    <w:p>
+      <w:pPr>
+        <w:pStyle w:val="Heading3"/>
+        <w:bidi w:val="0"/>
+        <w:ind w:hanging="0" w:start="0" w:end="0"/>
+        <w:jc w:val="start"/>
+        <w:rPr/>
+      </w:pPr>
+      <w:r>
+        <w:t>13. Остановка и защиты при РАЗРЫВЕ</w:t>
+      </w:r>
+    </w:p>
+    <w:p>
+      <w:pPr>
+        <w:pStyle w:val="BodyText"/>
+        <w:numPr>
+          <w:ilvl w:val="0"/>
+          <w:numId w:val="2"/>
+        </w:numPr>
+        <w:pBdr/>
+        <w:tabs>
+          <w:tab w:val="clear" w:pos="709"/>
+          <w:tab w:val="left" w:pos="709" w:leader="none"/>
+        </w:tabs>
+        <w:bidi w:val="0"/>
+        <w:spacing w:before="0" w:after="0"/>
+        <w:ind w:hanging="283" w:start="709" w:end="0"/>
+        <w:jc w:val="start"/>
+        <w:rPr/>
+      </w:pPr>
+      <w:r>
+        <w:t>Принудительная остановка и аварийные стопы работают так же, как описано в разделе 6:</w:t>
+      </w:r>
+    </w:p>
+    <w:p>
+      <w:pPr>
+        <w:pStyle w:val="BodyText"/>
+        <w:numPr>
+          <w:ilvl w:val="1"/>
+          <w:numId w:val="2"/>
+        </w:numPr>
+        <w:pBdr/>
+        <w:tabs>
+          <w:tab w:val="clear" w:pos="709"/>
+          <w:tab w:val="left" w:pos="709" w:leader="none"/>
+        </w:tabs>
+        <w:bidi w:val="0"/>
+        <w:spacing w:before="90" w:after="0"/>
+        <w:ind w:hanging="283" w:start="709" w:end="0"/>
+        <w:jc w:val="start"/>
+        <w:rPr/>
+      </w:pPr>
+      <w:r>
+        <w:t>Долгое нажатие кнопки на панели во время программы — остановка.</w:t>
+      </w:r>
+    </w:p>
+    <w:p>
+      <w:pPr>
+        <w:pStyle w:val="BodyText"/>
+        <w:numPr>
+          <w:ilvl w:val="1"/>
+          <w:numId w:val="2"/>
+        </w:numPr>
+        <w:pBdr/>
+        <w:tabs>
+          <w:tab w:val="clear" w:pos="709"/>
+          <w:tab w:val="left" w:pos="709" w:leader="none"/>
+        </w:tabs>
+        <w:bidi w:val="0"/>
+        <w:spacing w:before="90" w:after="0"/>
+        <w:ind w:hanging="283" w:start="709" w:end="0"/>
+        <w:jc w:val="start"/>
+        <w:rPr/>
+      </w:pPr>
+      <w:r>
+        <w:t>Кнопка СТОП в веб-интерфейсе — немедленная остановка.</w:t>
+      </w:r>
+    </w:p>
+    <w:p>
+      <w:pPr>
+        <w:pStyle w:val="BodyText"/>
+        <w:numPr>
+          <w:ilvl w:val="1"/>
+          <w:numId w:val="2"/>
+        </w:numPr>
+        <w:pBdr/>
+        <w:tabs>
+          <w:tab w:val="clear" w:pos="709"/>
+          <w:tab w:val="left" w:pos="709" w:leader="none"/>
+        </w:tabs>
+        <w:bidi w:val="0"/>
+        <w:spacing w:before="90" w:after="0"/>
+        <w:ind w:hanging="283" w:start="709" w:end="0"/>
+        <w:jc w:val="start"/>
+        <w:rPr/>
+      </w:pPr>
+      <w:r>
+        <w:t>Превышение LIM., сильный уход показаний в минус, пределы энкодера — автоматический стоп с сигнализацией.</w:t>
+      </w:r>
+    </w:p>
+    <w:p>
+      <w:pPr>
+        <w:pStyle w:val="BodyText"/>
+        <w:numPr>
+          <w:ilvl w:val="0"/>
+          <w:numId w:val="2"/>
+        </w:numPr>
+        <w:pBdr/>
+        <w:tabs>
+          <w:tab w:val="clear" w:pos="709"/>
+          <w:tab w:val="left" w:pos="709" w:leader="none"/>
+        </w:tabs>
+        <w:bidi w:val="0"/>
+        <w:spacing w:before="0" w:after="0"/>
+        <w:ind w:hanging="283" w:start="709" w:end="0"/>
+        <w:jc w:val="start"/>
+        <w:rPr/>
+      </w:pPr>
+      <w:r>
+        <w:t>После принудительной остановки результат может быть сохранён как «остановлено пользователем»; при успешном разрыве — как выполненное измерение с максимальной нагрузкой.</w:t>
+      </w:r>
+    </w:p>
+    <w:p>
+      <w:pPr>
+        <w:pStyle w:val="BodyText"/>
+        <w:bidi w:val="0"/>
+        <w:ind w:hanging="0" w:start="0" w:end="0"/>
+        <w:jc w:val="center"/>
+        <w:rPr>
+          <w:b/>
+          <w:bCs/>
+        </w:rPr>
+      </w:pPr>
+    </w:p>
+    <w:p>
+      <w:pPr>
+        <w:pStyle w:val="Heading3"/>
+        <w:bidi w:val="0"/>
+        <w:ind w:hanging="0" w:start="0" w:end="0"/>
+        <w:jc w:val="start"/>
+        <w:rPr/>
+      </w:pPr>
+      <w:r>
+        <w:t>14. Работа через веб-интерфейс (программа РАЗРЫВ)</w:t>
+      </w:r>
+    </w:p>
+    <w:p>
+      <w:pPr>
+        <w:pStyle w:val="BodyText"/>
+        <w:numPr>
+          <w:ilvl w:val="0"/>
+          <w:numId w:val="2"/>
+        </w:numPr>
+        <w:pBdr/>
+        <w:tabs>
+          <w:tab w:val="clear" w:pos="709"/>
+          <w:tab w:val="left" w:pos="709" w:leader="none"/>
+        </w:tabs>
+        <w:bidi w:val="0"/>
+        <w:spacing w:before="0" w:after="0"/>
+        <w:ind w:hanging="283" w:start="709" w:end="0"/>
+        <w:jc w:val="start"/>
+        <w:rPr/>
+      </w:pPr>
+      <w:r>
+        <w:t>Откройте в браузере страницу устройства и перейдите на вкладку «РАЗРЫВ».</w:t>
+      </w:r>
+    </w:p>
+    <w:p>
+      <w:pPr>
+        <w:pStyle w:val="BodyText"/>
+        <w:numPr>
+          <w:ilvl w:val="0"/>
+          <w:numId w:val="2"/>
+        </w:numPr>
+        <w:pBdr/>
+        <w:tabs>
+          <w:tab w:val="clear" w:pos="709"/>
+          <w:tab w:val="left" w:pos="709" w:leader="none"/>
+        </w:tabs>
+        <w:bidi w:val="0"/>
+        <w:spacing w:before="0" w:after="0"/>
+        <w:ind w:hanging="283" w:start="709" w:end="0"/>
+        <w:jc w:val="start"/>
+        <w:rPr/>
+      </w:pPr>
+      <w:r>
+        <w:t>Там вы можете:</w:t>
+      </w:r>
+    </w:p>
+    <w:p>
+      <w:pPr>
+        <w:pStyle w:val="BodyText"/>
+        <w:numPr>
+          <w:ilvl w:val="1"/>
+          <w:numId w:val="2"/>
+        </w:numPr>
+        <w:pBdr/>
+        <w:tabs>
+          <w:tab w:val="clear" w:pos="709"/>
+          <w:tab w:val="left" w:pos="709" w:leader="none"/>
+        </w:tabs>
+        <w:bidi w:val="0"/>
+        <w:spacing w:before="90" w:after="0"/>
+        <w:ind w:hanging="283" w:start="709" w:end="0"/>
+        <w:jc w:val="start"/>
+        <w:rPr/>
+      </w:pPr>
+      <w:r>
+        <w:t>Видеть текущий вес, максимум, рабочее и абсолютное перемещение, статус программы.</w:t>
+      </w:r>
+    </w:p>
+    <w:p>
+      <w:pPr>
+        <w:pStyle w:val="BodyText"/>
+        <w:numPr>
+          <w:ilvl w:val="1"/>
+          <w:numId w:val="2"/>
+        </w:numPr>
+        <w:pBdr/>
+        <w:tabs>
+          <w:tab w:val="clear" w:pos="709"/>
+          <w:tab w:val="left" w:pos="709" w:leader="none"/>
+        </w:tabs>
+        <w:bidi w:val="0"/>
+        <w:spacing w:before="90" w:after="0"/>
+        <w:ind w:hanging="283" w:start="709" w:end="0"/>
+        <w:jc w:val="start"/>
+        <w:rPr/>
+      </w:pPr>
+      <w:r>
+        <w:t>Сбросить отображаемый максимум (кнопка сброса MAX).</w:t>
+      </w:r>
+    </w:p>
+    <w:p>
+      <w:pPr>
+        <w:pStyle w:val="BodyText"/>
+        <w:numPr>
+          <w:ilvl w:val="1"/>
+          <w:numId w:val="2"/>
+        </w:numPr>
+        <w:pBdr/>
+        <w:tabs>
+          <w:tab w:val="clear" w:pos="709"/>
+          <w:tab w:val="left" w:pos="709" w:leader="none"/>
+        </w:tabs>
+        <w:bidi w:val="0"/>
+        <w:spacing w:before="90" w:after="0"/>
+        <w:ind w:hanging="283" w:start="709" w:end="0"/>
+        <w:jc w:val="start"/>
+        <w:rPr/>
+      </w:pPr>
+      <w:r>
+        <w:t>Запустить программу РАЗРЫВ или остановить программу.</w:t>
+      </w:r>
+    </w:p>
+    <w:p>
+      <w:pPr>
+        <w:pStyle w:val="BodyText"/>
+        <w:numPr>
+          <w:ilvl w:val="0"/>
+          <w:numId w:val="2"/>
+        </w:numPr>
+        <w:pBdr/>
+        <w:tabs>
+          <w:tab w:val="clear" w:pos="709"/>
+          <w:tab w:val="left" w:pos="709" w:leader="none"/>
+        </w:tabs>
+        <w:bidi w:val="0"/>
+        <w:spacing w:before="0" w:after="0"/>
+        <w:ind w:hanging="283" w:start="709" w:end="0"/>
+        <w:jc w:val="start"/>
+        <w:rPr/>
+      </w:pPr>
+      <w:r>
+        <w:t>Порог падения (%) задаётся в разделе настроек программы (поле «Порог падения для разрыва»). Порог начала накопления (1 N по умолчанию) общий со СЖАТИЕМ.</w:t>
+      </w:r>
+    </w:p>
+    <w:p>
+      <w:pPr>
+        <w:pStyle w:val="BodyText"/>
+        <w:bidi w:val="0"/>
+        <w:ind w:hanging="0" w:start="0" w:end="0"/>
+        <w:jc w:val="center"/>
+        <w:rPr>
+          <w:b/>
+          <w:bCs/>
+        </w:rPr>
+      </w:pPr>
+    </w:p>
+    <w:p>
+      <w:pPr>
+        <w:pStyle w:val="Heading3"/>
+        <w:bidi w:val="0"/>
+        <w:ind w:hanging="0" w:start="0" w:end="0"/>
+        <w:jc w:val="start"/>
+        <w:rPr/>
+      </w:pPr>
+      <w:r>
+        <w:t>15. Рекомендуемый сценарий для обычного оператора (РАЗРЫВ)</w:t>
+      </w:r>
+    </w:p>
+    <w:p>
+      <w:pPr>
+        <w:pStyle w:val="BodyText"/>
+        <w:numPr>
+          <w:ilvl w:val="0"/>
+          <w:numId w:val="2"/>
+        </w:numPr>
+        <w:pBdr/>
+        <w:tabs>
+          <w:tab w:val="clear" w:pos="709"/>
+          <w:tab w:val="left" w:pos="709" w:leader="none"/>
+        </w:tabs>
+        <w:bidi w:val="0"/>
+        <w:spacing w:before="0" w:after="0"/>
+        <w:ind w:hanging="283" w:start="709" w:end="0"/>
+        <w:jc w:val="start"/>
+        <w:rPr/>
+      </w:pPr>
+      <w:r>
+        <w:t>Включить установку и дождаться загрузки.</w:t>
+      </w:r>
+    </w:p>
+    <w:p>
+      <w:pPr>
+        <w:pStyle w:val="BodyText"/>
+        <w:numPr>
+          <w:ilvl w:val="0"/>
+          <w:numId w:val="2"/>
+        </w:numPr>
+        <w:pBdr/>
+        <w:tabs>
+          <w:tab w:val="clear" w:pos="709"/>
+          <w:tab w:val="left" w:pos="709" w:leader="none"/>
+        </w:tabs>
+        <w:bidi w:val="0"/>
+        <w:spacing w:before="0" w:after="0"/>
+        <w:ind w:hanging="283" w:start="709" w:end="0"/>
+        <w:jc w:val="start"/>
+        <w:rPr/>
+      </w:pPr>
+      <w:r>
+        <w:t>Короткими нажатиями перейти на экран BREAK.</w:t>
+      </w:r>
+    </w:p>
+    <w:p>
+      <w:pPr>
+        <w:pStyle w:val="BodyText"/>
+        <w:numPr>
+          <w:ilvl w:val="0"/>
+          <w:numId w:val="2"/>
+        </w:numPr>
+        <w:pBdr/>
+        <w:tabs>
+          <w:tab w:val="clear" w:pos="709"/>
+          <w:tab w:val="left" w:pos="709" w:leader="none"/>
+        </w:tabs>
+        <w:bidi w:val="0"/>
+        <w:spacing w:before="0" w:after="0"/>
+        <w:ind w:hanging="283" w:start="709" w:end="0"/>
+        <w:jc w:val="start"/>
+        <w:rPr/>
+      </w:pPr>
+      <w:r>
+        <w:t>Установить образец, убедиться, что верхняя плита чуть касается (или близко).</w:t>
+      </w:r>
+    </w:p>
+    <w:p>
+      <w:pPr>
+        <w:pStyle w:val="BodyText"/>
+        <w:numPr>
+          <w:ilvl w:val="0"/>
+          <w:numId w:val="2"/>
+        </w:numPr>
+        <w:pBdr/>
+        <w:tabs>
+          <w:tab w:val="clear" w:pos="709"/>
+          <w:tab w:val="left" w:pos="709" w:leader="none"/>
+        </w:tabs>
+        <w:bidi w:val="0"/>
+        <w:spacing w:before="0" w:after="0"/>
+        <w:ind w:hanging="283" w:start="709" w:end="0"/>
+        <w:jc w:val="start"/>
+        <w:rPr/>
+      </w:pPr>
+      <w:r>
+        <w:t>Проверить на экране:</w:t>
+      </w:r>
+    </w:p>
+    <w:p>
+      <w:pPr>
+        <w:pStyle w:val="BodyText"/>
+        <w:numPr>
+          <w:ilvl w:val="1"/>
+          <w:numId w:val="2"/>
+        </w:numPr>
+        <w:pBdr/>
+        <w:tabs>
+          <w:tab w:val="clear" w:pos="709"/>
+          <w:tab w:val="left" w:pos="709" w:leader="none"/>
+        </w:tabs>
+        <w:bidi w:val="0"/>
+        <w:spacing w:before="90" w:after="0"/>
+        <w:ind w:hanging="283" w:start="709" w:end="0"/>
+        <w:jc w:val="start"/>
+        <w:rPr/>
+      </w:pPr>
+      <w:r>
+        <w:t>Текущий вес ≈ 0 N.</w:t>
+      </w:r>
+    </w:p>
+    <w:p>
+      <w:pPr>
+        <w:pStyle w:val="BodyText"/>
+        <w:numPr>
+          <w:ilvl w:val="1"/>
+          <w:numId w:val="2"/>
+        </w:numPr>
+        <w:pBdr/>
+        <w:tabs>
+          <w:tab w:val="clear" w:pos="709"/>
+          <w:tab w:val="left" w:pos="709" w:leader="none"/>
+        </w:tabs>
+        <w:bidi w:val="0"/>
+        <w:spacing w:before="90" w:after="0"/>
+        <w:ind w:hanging="283" w:start="709" w:end="0"/>
+        <w:jc w:val="start"/>
+        <w:rPr/>
+      </w:pPr>
+      <w:r>
+        <w:t>Программа не запущена, статус «Готово».</w:t>
+      </w:r>
+    </w:p>
+    <w:p>
+      <w:pPr>
+        <w:pStyle w:val="BodyText"/>
+        <w:numPr>
+          <w:ilvl w:val="0"/>
+          <w:numId w:val="2"/>
+        </w:numPr>
+        <w:pBdr/>
+        <w:tabs>
+          <w:tab w:val="clear" w:pos="709"/>
+          <w:tab w:val="left" w:pos="709" w:leader="none"/>
+        </w:tabs>
+        <w:bidi w:val="0"/>
+        <w:spacing w:before="0" w:after="0"/>
+        <w:ind w:hanging="283" w:start="709" w:end="0"/>
+        <w:jc w:val="start"/>
+        <w:rPr/>
+      </w:pPr>
+      <w:r>
+        <w:t>Запустить программу РАЗРЫВ (меню START на экране BREAK или кнопка в веб-интерфейсе).</w:t>
+      </w:r>
+    </w:p>
+    <w:p>
+      <w:pPr>
+        <w:pStyle w:val="BodyText"/>
+        <w:numPr>
+          <w:ilvl w:val="0"/>
+          <w:numId w:val="2"/>
+        </w:numPr>
+        <w:pBdr/>
+        <w:tabs>
+          <w:tab w:val="clear" w:pos="709"/>
+          <w:tab w:val="left" w:pos="709" w:leader="none"/>
+        </w:tabs>
+        <w:bidi w:val="0"/>
+        <w:spacing w:before="0" w:after="0"/>
+        <w:ind w:hanging="283" w:start="709" w:end="0"/>
+        <w:jc w:val="start"/>
+        <w:rPr/>
+      </w:pPr>
+      <w:r>
+        <w:t>Дождаться окончания (по завершении — одиночный протяжный гудок; MAX. = результат).</w:t>
+      </w:r>
+    </w:p>
+    <w:p>
+      <w:pPr>
+        <w:pStyle w:val="BodyText"/>
+        <w:numPr>
+          <w:ilvl w:val="0"/>
+          <w:numId w:val="2"/>
+        </w:numPr>
+        <w:pBdr/>
+        <w:tabs>
+          <w:tab w:val="clear" w:pos="709"/>
+          <w:tab w:val="left" w:pos="709" w:leader="none"/>
+        </w:tabs>
+        <w:bidi w:val="0"/>
+        <w:spacing w:before="0" w:after="0"/>
+        <w:ind w:hanging="283" w:start="709" w:end="0"/>
+        <w:jc w:val="start"/>
+        <w:rPr/>
+      </w:pPr>
+      <w:r>
+        <w:t>После завершения:</w:t>
+      </w:r>
+    </w:p>
+    <w:p>
+      <w:pPr>
+        <w:pStyle w:val="BodyText"/>
+        <w:numPr>
+          <w:ilvl w:val="1"/>
+          <w:numId w:val="2"/>
+        </w:numPr>
+        <w:pBdr/>
+        <w:tabs>
+          <w:tab w:val="clear" w:pos="709"/>
+          <w:tab w:val="left" w:pos="709" w:leader="none"/>
+        </w:tabs>
+        <w:bidi w:val="0"/>
+        <w:spacing w:before="90" w:after="0"/>
+        <w:ind w:hanging="283" w:start="709" w:end="0"/>
+        <w:jc w:val="start"/>
+        <w:rPr/>
+      </w:pPr>
+      <w:r>
+        <w:t>При необходимости поднять шток вручную.</w:t>
+      </w:r>
+    </w:p>
+    <w:p>
+      <w:pPr>
+        <w:pStyle w:val="BodyText"/>
+        <w:numPr>
+          <w:ilvl w:val="1"/>
+          <w:numId w:val="2"/>
+        </w:numPr>
+        <w:pBdr/>
+        <w:tabs>
+          <w:tab w:val="clear" w:pos="709"/>
+          <w:tab w:val="left" w:pos="709" w:leader="none"/>
+        </w:tabs>
+        <w:bidi w:val="0"/>
+        <w:spacing w:before="90" w:after="0"/>
+        <w:ind w:hanging="283" w:start="709" w:end="0"/>
+        <w:jc w:val="start"/>
+        <w:rPr/>
+      </w:pPr>
+      <w:r>
+        <w:t>Записать максимальную нагрузку (и перемещение, если требуется).</w:t>
+      </w:r>
+    </w:p>
+    <w:p>
+      <w:pPr>
+        <w:pStyle w:val="BodyText"/>
+        <w:numPr>
+          <w:ilvl w:val="1"/>
+          <w:numId w:val="2"/>
+        </w:numPr>
+        <w:pBdr/>
+        <w:tabs>
+          <w:tab w:val="clear" w:pos="709"/>
+          <w:tab w:val="left" w:pos="709" w:leader="none"/>
+        </w:tabs>
+        <w:bidi w:val="0"/>
+        <w:spacing w:before="90" w:after="0"/>
+        <w:ind w:hanging="283" w:start="709" w:end="0"/>
+        <w:jc w:val="start"/>
+        <w:rPr/>
+      </w:pPr>
+      <w:r>
+        <w:t>Снять образец / остатки.</w:t>
+      </w:r>
+    </w:p>
+    <w:p>
+      <w:pPr>
+        <w:pStyle w:val="BodyText"/>
+        <w:numPr>
+          <w:ilvl w:val="1"/>
+          <w:numId w:val="2"/>
+        </w:numPr>
+        <w:pBdr/>
+        <w:tabs>
+          <w:tab w:val="clear" w:pos="709"/>
+          <w:tab w:val="left" w:pos="709" w:leader="none"/>
+        </w:tabs>
+        <w:bidi w:val="0"/>
+        <w:spacing w:before="90" w:after="0"/>
+        <w:ind w:hanging="283" w:start="709" w:end="0"/>
+        <w:jc w:val="start"/>
+        <w:rPr/>
+      </w:pPr>
+      <w:r>
+        <w:t>При необходимости — повторить цикл для следующего образца.</w:t>
       </w:r>
     </w:p>
     <w:p>

</xml_diff>